<commit_message>
Audit fixes part 1: correctness (team split, firm-level code reviews, confirmed dates, profile reuse, assignment, processing lock, amount and flag limits) and repository cleanup
</commit_message>
<xml_diff>
--- a/docs/Trade_Import_Build_Log.docx
+++ b/docs/Trade_Import_Build_Log.docx
@@ -374,7 +374,7 @@
                 <w:sz w:val="18"/>
                 <w:szCs w:val="18"/>
               </w:rPr>
-              <w:t xml:space="preserve">Phases 1 and 2 deployed and verified end to end. Phase 3A (deterministic matching and the Code Follow-Up list) built; deployed and verified end to end 2026-10-14. Phase 3B (Claude suggestions, review decisions, roster approval, mapping proposals, matching rules) deployed with fixes 3B.1 and 3B.2 (110 of 110 tests) and verified end to end 2026-10-21. Phase 4a (Standard tier: Anthropic API provider) passed the org dry run (118 tests) 2026-10-21. Phase 4b (Trade Review app) passed the org dry run (132 tests) 2026-10-22; 4b.1a (names, issue types, full demo reset, complete sample data) and 4b.2 (headlines, On Hold, per-field Claude answers, roster preview, firm follow-up email, token logging and prompt caching) passed the org dry run (145 of 145 tests) 2026-10-23; 4b.2a (one table layout, code issues in Dealer Code Review, Email Firms tab) passed the org dry run (146 of 146 tests) 2026-10-25; 4b.3 (shared issues decided together) built and locally verified 2026-10-25. Next: 4c (cloud storage pull).</w:t>
+              <w:t xml:space="preserve">Phases 1 and 2 deployed and verified end to end. Phase 3A (deterministic matching and the Code Follow-Up list) built; deployed and verified end to end 2026-10-14. Phase 3B (Claude suggestions, review decisions, roster approval, mapping proposals, matching rules) deployed with fixes 3B.1 and 3B.2 (110 of 110 tests) and verified end to end 2026-10-21. Phase 4a (Standard tier: Anthropic API provider) passed the org dry run (118 tests) 2026-10-21. Phase 4b (Trade Review app) passed the org dry run (132 tests) 2026-10-22; 4b.1a (names, issue types, full demo reset, complete sample data) and 4b.2 (headlines, On Hold, per-field Claude answers, roster preview, firm follow-up email, token logging and prompt caching) passed the org dry run (145 of 145 tests) 2026-10-23; 4b.2a (one table layout, code issues in Dealer Code Review, Email Firms tab) passed the org dry run (146 of 146 tests) 2026-10-25; 4b.3 (shared issues decided together) built 2026-10-25; audit fixes part 1 passed the org dry run (159 of 159 tests) 2026-10-28. Next: 4c (cloud storage pull).</w:t>
             </w:r>
           </w:p>
         </w:tc>
@@ -47511,6 +47511,736 @@
           <w:szCs w:val="20"/>
         </w:rPr>
         <w:t xml:space="preserve">Rows with the same issue key share the same problem and are decided together in Trade Review. Set by the system.</w:t>
+      </w:r>
+    </w:p>
+    <w:p>
+      <w:pPr>
+        <w:pStyle w:val="Heading1"/>
+      </w:pPr>
+      <w:r>
+        <w:t xml:space="preserve">19. Code audit and fixes, part 1 (2026-10-26)</w:t>
+      </w:r>
+    </w:p>
+    <w:p>
+      <w:pPr>
+        <w:spacing w:after="120"/>
+      </w:pPr>
+      <w:r>
+        <w:t xml:space="preserve">An independent audit (a separate agent that had not seen the code being built) read every class, trigger and component and ran the local checks on a copy. Its verdict: the pipeline design, the Claude safety model and the tests are strong; the weaknesses are the security model of the background steps, concurrency around Claude, a few matching edge cases and accuracy in the public repository. The findings are in CODE_AUDIT.md in the Claude Project. Part 1 fixes the repository findings and the small correctness findings; the security model (F-01), Claude concurrency (F-02), per-issue Claude calls, prompt-cache layout (F-19), the stranded-work sweeper (F-08), CI (F-29) and the larger refactors follow.</w:t>
+      </w:r>
+    </w:p>
+    <w:p>
+      <w:pPr>
+        <w:pStyle w:val="Heading2"/>
+      </w:pPr>
+      <w:r>
+        <w:t xml:space="preserve">19.1 Correctness fixes</w:t>
+      </w:r>
+    </w:p>
+    <w:tbl>
+      <w:tblPr>
+        <w:tblW w:type="dxa" w:w="9360"/>
+        <w:tblBorders>
+          <w:top w:val="single" w:color="auto" w:sz="4"/>
+          <w:left w:val="single" w:color="auto" w:sz="4"/>
+          <w:bottom w:val="single" w:color="auto" w:sz="4"/>
+          <w:right w:val="single" w:color="auto" w:sz="4"/>
+          <w:insideH w:val="single" w:color="auto" w:sz="4"/>
+          <w:insideV w:val="single" w:color="auto" w:sz="4"/>
+        </w:tblBorders>
+      </w:tblPr>
+      <w:tblGrid>
+        <w:gridCol w:w="3000"/>
+        <w:gridCol w:w="6360"/>
+      </w:tblGrid>
+      <w:tr>
+        <w:trPr>
+          <w:tblHeader/>
+        </w:trPr>
+        <w:tc>
+          <w:tcPr>
+            <w:tcW w:type="dxa" w:w="3000"/>
+            <w:tcBorders>
+              <w:top w:val="single" w:color="BFBFBF" w:sz="4"/>
+              <w:left w:val="single" w:color="BFBFBF" w:sz="4"/>
+              <w:bottom w:val="single" w:color="BFBFBF" w:sz="4"/>
+              <w:right w:val="single" w:color="BFBFBF" w:sz="4"/>
+            </w:tcBorders>
+            <w:shd w:fill="DCE6F1" w:color="auto" w:val="clear"/>
+            <w:tcMar>
+              <w:top w:type="dxa" w:w="60"/>
+              <w:left w:type="dxa" w:w="100"/>
+              <w:bottom w:type="dxa" w:w="60"/>
+              <w:right w:type="dxa" w:w="100"/>
+            </w:tcMar>
+          </w:tcPr>
+          <w:p>
+            <w:r>
+              <w:rPr>
+                <w:b/>
+                <w:bCs/>
+                <w:sz w:val="18"/>
+                <w:szCs w:val="18"/>
+              </w:rPr>
+              <w:t xml:space="preserve">Finding</w:t>
+            </w:r>
+          </w:p>
+        </w:tc>
+        <w:tc>
+          <w:tcPr>
+            <w:tcW w:type="dxa" w:w="6360"/>
+            <w:tcBorders>
+              <w:top w:val="single" w:color="BFBFBF" w:sz="4"/>
+              <w:left w:val="single" w:color="BFBFBF" w:sz="4"/>
+              <w:bottom w:val="single" w:color="BFBFBF" w:sz="4"/>
+              <w:right w:val="single" w:color="BFBFBF" w:sz="4"/>
+            </w:tcBorders>
+            <w:shd w:fill="DCE6F1" w:color="auto" w:val="clear"/>
+            <w:tcMar>
+              <w:top w:type="dxa" w:w="60"/>
+              <w:left w:type="dxa" w:w="100"/>
+              <w:bottom w:type="dxa" w:w="60"/>
+              <w:right w:type="dxa" w:w="100"/>
+            </w:tcMar>
+          </w:tcPr>
+          <w:p>
+            <w:r>
+              <w:rPr>
+                <w:b/>
+                <w:bCs/>
+                <w:sz w:val="18"/>
+                <w:szCs w:val="18"/>
+              </w:rPr>
+              <w:t xml:space="preserve">Fix</w:t>
+            </w:r>
+          </w:p>
+        </w:tc>
+      </w:tr>
+      <w:tr>
+        <w:tc>
+          <w:tcPr>
+            <w:tcW w:type="dxa" w:w="3000"/>
+            <w:tcBorders>
+              <w:top w:val="single" w:color="BFBFBF" w:sz="4"/>
+              <w:left w:val="single" w:color="BFBFBF" w:sz="4"/>
+              <w:bottom w:val="single" w:color="BFBFBF" w:sz="4"/>
+              <w:right w:val="single" w:color="BFBFBF" w:sz="4"/>
+            </w:tcBorders>
+            <w:tcMar>
+              <w:top w:type="dxa" w:w="60"/>
+              <w:left w:type="dxa" w:w="100"/>
+              <w:bottom w:type="dxa" w:w="60"/>
+              <w:right w:type="dxa" w:w="100"/>
+            </w:tcMar>
+          </w:tcPr>
+          <w:p>
+            <w:r>
+              <w:rPr>
+                <w:sz w:val="18"/>
+                <w:szCs w:val="18"/>
+              </w:rPr>
+              <w:t xml:space="preserve">F-04 Team split credited people the name rules out</w:t>
+            </w:r>
+          </w:p>
+        </w:tc>
+        <w:tc>
+          <w:tcPr>
+            <w:tcW w:type="dxa" w:w="6360"/>
+            <w:tcBorders>
+              <w:top w:val="single" w:color="BFBFBF" w:sz="4"/>
+              <w:left w:val="single" w:color="BFBFBF" w:sz="4"/>
+              <w:bottom w:val="single" w:color="BFBFBF" w:sz="4"/>
+              <w:right w:val="single" w:color="BFBFBF" w:sz="4"/>
+            </w:tcBorders>
+            <w:tcMar>
+              <w:top w:type="dxa" w:w="60"/>
+              <w:left w:type="dxa" w:w="100"/>
+              <w:bottom w:type="dxa" w:w="60"/>
+              <w:right w:type="dxa" w:w="100"/>
+            </w:tcMar>
+          </w:tcPr>
+          <w:p>
+            <w:r>
+              <w:rPr>
+                <w:sz w:val="18"/>
+                <w:szCs w:val="18"/>
+              </w:rPr>
+              <w:t xml:space="preserve">When a row's name fits some members of a team code but not all ("Chen" on a team with Ryan Chen, Megan Chen and Julia Morales), the row goes to Dealer Code Review with ADVISOR_AMBIGUOUS and the members it fits as the choices. The reviewer's choice is stored in the new Advisor Override field; re-matching credits that member 100% (ADVISOR_FROM_REVIEWER). Claude is asked to choose among the same members.</w:t>
+            </w:r>
+          </w:p>
+        </w:tc>
+      </w:tr>
+      <w:tr>
+        <w:tc>
+          <w:tcPr>
+            <w:tcW w:type="dxa" w:w="3000"/>
+            <w:tcBorders>
+              <w:top w:val="single" w:color="BFBFBF" w:sz="4"/>
+              <w:left w:val="single" w:color="BFBFBF" w:sz="4"/>
+              <w:bottom w:val="single" w:color="BFBFBF" w:sz="4"/>
+              <w:right w:val="single" w:color="BFBFBF" w:sz="4"/>
+            </w:tcBorders>
+            <w:tcMar>
+              <w:top w:type="dxa" w:w="60"/>
+              <w:left w:type="dxa" w:w="100"/>
+              <w:bottom w:type="dxa" w:w="60"/>
+              <w:right w:type="dxa" w:w="100"/>
+            </w:tcMar>
+          </w:tcPr>
+          <w:p>
+            <w:r>
+              <w:rPr>
+                <w:sz w:val="18"/>
+                <w:szCs w:val="18"/>
+              </w:rPr>
+              <w:t xml:space="preserve">F-05 Code reviews were grouped by dealer, not firm</w:t>
+            </w:r>
+          </w:p>
+        </w:tc>
+        <w:tc>
+          <w:tcPr>
+            <w:tcW w:type="dxa" w:w="6360"/>
+            <w:tcBorders>
+              <w:top w:val="single" w:color="BFBFBF" w:sz="4"/>
+              <w:left w:val="single" w:color="BFBFBF" w:sz="4"/>
+              <w:bottom w:val="single" w:color="BFBFBF" w:sz="4"/>
+              <w:right w:val="single" w:color="BFBFBF" w:sz="4"/>
+            </w:tcBorders>
+            <w:tcMar>
+              <w:top w:type="dxa" w:w="60"/>
+              <w:left w:type="dxa" w:w="100"/>
+              <w:bottom w:type="dxa" w:w="60"/>
+              <w:right w:type="dxa" w:w="100"/>
+            </w:tcMar>
+          </w:tcPr>
+          <w:p>
+            <w:r>
+              <w:rPr>
+                <w:sz w:val="18"/>
+                <w:szCs w:val="18"/>
+              </w:rPr>
+              <w:t xml:space="preserve">The follow-up key is now the matched firm's Id + code + reason, so a dealer file covering two firms (Kestrel Inc. and Ltd.) gives each firm its own code review, roster approval resolves the right one, and the email goes to the right firm. DemoScenarioTest now identifies follow-ups by firm, code and reason instead of by the key text.</w:t>
+            </w:r>
+          </w:p>
+        </w:tc>
+      </w:tr>
+      <w:tr>
+        <w:tc>
+          <w:tcPr>
+            <w:tcW w:type="dxa" w:w="3000"/>
+            <w:tcBorders>
+              <w:top w:val="single" w:color="BFBFBF" w:sz="4"/>
+              <w:left w:val="single" w:color="BFBFBF" w:sz="4"/>
+              <w:bottom w:val="single" w:color="BFBFBF" w:sz="4"/>
+              <w:right w:val="single" w:color="BFBFBF" w:sz="4"/>
+            </w:tcBorders>
+            <w:tcMar>
+              <w:top w:type="dxa" w:w="60"/>
+              <w:left w:type="dxa" w:w="100"/>
+              <w:bottom w:type="dxa" w:w="60"/>
+              <w:right w:type="dxa" w:w="100"/>
+            </w:tcMar>
+          </w:tcPr>
+          <w:p>
+            <w:r>
+              <w:rPr>
+                <w:sz w:val="18"/>
+                <w:szCs w:val="18"/>
+              </w:rPr>
+              <w:t xml:space="preserve">F-06 Last Confirmed Trade Date was never written</w:t>
+            </w:r>
+          </w:p>
+        </w:tc>
+        <w:tc>
+          <w:tcPr>
+            <w:tcW w:type="dxa" w:w="6360"/>
+            <w:tcBorders>
+              <w:top w:val="single" w:color="BFBFBF" w:sz="4"/>
+              <w:left w:val="single" w:color="BFBFBF" w:sz="4"/>
+              <w:bottom w:val="single" w:color="BFBFBF" w:sz="4"/>
+              <w:right w:val="single" w:color="BFBFBF" w:sz="4"/>
+            </w:tcBorders>
+            <w:tcMar>
+              <w:top w:type="dxa" w:w="60"/>
+              <w:left w:type="dxa" w:w="100"/>
+              <w:bottom w:type="dxa" w:w="60"/>
+              <w:right w:type="dxa" w:w="100"/>
+            </w:tcMar>
+          </w:tcPr>
+          <w:p>
+            <w:r>
+              <w:rPr>
+                <w:sz w:val="18"/>
+                <w:szCs w:val="18"/>
+              </w:rPr>
+              <w:t xml:space="preserve">Each matched trade moves its credited assignments' date forward (all members for a team split). Written in system mode for that one field, because the integration user has no edit access to assignments.</w:t>
+            </w:r>
+          </w:p>
+        </w:tc>
+      </w:tr>
+      <w:tr>
+        <w:tc>
+          <w:tcPr>
+            <w:tcW w:type="dxa" w:w="3000"/>
+            <w:tcBorders>
+              <w:top w:val="single" w:color="BFBFBF" w:sz="4"/>
+              <w:left w:val="single" w:color="BFBFBF" w:sz="4"/>
+              <w:bottom w:val="single" w:color="BFBFBF" w:sz="4"/>
+              <w:right w:val="single" w:color="BFBFBF" w:sz="4"/>
+            </w:tcBorders>
+            <w:tcMar>
+              <w:top w:type="dxa" w:w="60"/>
+              <w:left w:type="dxa" w:w="100"/>
+              <w:bottom w:type="dxa" w:w="60"/>
+              <w:right w:type="dxa" w:w="100"/>
+            </w:tcMar>
+          </w:tcPr>
+          <w:p>
+            <w:r>
+              <w:rPr>
+                <w:sz w:val="18"/>
+                <w:szCs w:val="18"/>
+              </w:rPr>
+              <w:t xml:space="preserve">F-07 One dealer's single-firm profile could fill in its firm on another dealer's file</w:t>
+            </w:r>
+          </w:p>
+        </w:tc>
+        <w:tc>
+          <w:tcPr>
+            <w:tcW w:type="dxa" w:w="6360"/>
+            <w:tcBorders>
+              <w:top w:val="single" w:color="BFBFBF" w:sz="4"/>
+              <w:left w:val="single" w:color="BFBFBF" w:sz="4"/>
+              <w:bottom w:val="single" w:color="BFBFBF" w:sz="4"/>
+              <w:right w:val="single" w:color="BFBFBF" w:sz="4"/>
+            </w:tcBorders>
+            <w:tcMar>
+              <w:top w:type="dxa" w:w="60"/>
+              <w:left w:type="dxa" w:w="100"/>
+              <w:bottom w:type="dxa" w:w="60"/>
+              <w:right w:type="dxa" w:w="100"/>
+            </w:tcMar>
+          </w:tcPr>
+          <w:p>
+            <w:r>
+              <w:rPr>
+                <w:sz w:val="18"/>
+                <w:szCs w:val="18"/>
+              </w:rPr>
+              <w:t xml:space="preserve">When the only Active profile for a layout is another dealer's single-firm profile, the file is treated as a new layout for its own dealer (Mapping Review, Claude proposes a profile).</w:t>
+            </w:r>
+          </w:p>
+        </w:tc>
+      </w:tr>
+      <w:tr>
+        <w:tc>
+          <w:tcPr>
+            <w:tcW w:type="dxa" w:w="3000"/>
+            <w:tcBorders>
+              <w:top w:val="single" w:color="BFBFBF" w:sz="4"/>
+              <w:left w:val="single" w:color="BFBFBF" w:sz="4"/>
+              <w:bottom w:val="single" w:color="BFBFBF" w:sz="4"/>
+              <w:right w:val="single" w:color="BFBFBF" w:sz="4"/>
+            </w:tcBorders>
+            <w:tcMar>
+              <w:top w:type="dxa" w:w="60"/>
+              <w:left w:type="dxa" w:w="100"/>
+              <w:bottom w:type="dxa" w:w="60"/>
+              <w:right w:type="dxa" w:w="100"/>
+            </w:tcMar>
+          </w:tcPr>
+          <w:p>
+            <w:r>
+              <w:rPr>
+                <w:sz w:val="18"/>
+                <w:szCs w:val="18"/>
+              </w:rPr>
+              <w:t xml:space="preserve">F-03 Assigning a shared issue overwrote other reviewers' rows</w:t>
+            </w:r>
+          </w:p>
+        </w:tc>
+        <w:tc>
+          <w:tcPr>
+            <w:tcW w:type="dxa" w:w="6360"/>
+            <w:tcBorders>
+              <w:top w:val="single" w:color="BFBFBF" w:sz="4"/>
+              <w:left w:val="single" w:color="BFBFBF" w:sz="4"/>
+              <w:bottom w:val="single" w:color="BFBFBF" w:sz="4"/>
+              <w:right w:val="single" w:color="BFBFBF" w:sz="4"/>
+            </w:tcBorders>
+            <w:tcMar>
+              <w:top w:type="dxa" w:w="60"/>
+              <w:left w:type="dxa" w:w="100"/>
+              <w:bottom w:type="dxa" w:w="60"/>
+              <w:right w:type="dxa" w:w="100"/>
+            </w:tcMar>
+          </w:tcPr>
+          <w:p>
+            <w:r>
+              <w:rPr>
+                <w:sz w:val="18"/>
+                <w:szCs w:val="18"/>
+              </w:rPr>
+              <w:t xml:space="preserve">Taking an issue is refused if any of its rows is assigned to someone else; giving it back releases only your own rows.</w:t>
+            </w:r>
+          </w:p>
+        </w:tc>
+      </w:tr>
+      <w:tr>
+        <w:tc>
+          <w:tcPr>
+            <w:tcW w:type="dxa" w:w="3000"/>
+            <w:tcBorders>
+              <w:top w:val="single" w:color="BFBFBF" w:sz="4"/>
+              <w:left w:val="single" w:color="BFBFBF" w:sz="4"/>
+              <w:bottom w:val="single" w:color="BFBFBF" w:sz="4"/>
+              <w:right w:val="single" w:color="BFBFBF" w:sz="4"/>
+            </w:tcBorders>
+            <w:tcMar>
+              <w:top w:type="dxa" w:w="60"/>
+              <w:left w:type="dxa" w:w="100"/>
+              <w:bottom w:type="dxa" w:w="60"/>
+              <w:right w:type="dxa" w:w="100"/>
+            </w:tcMar>
+          </w:tcPr>
+          <w:p>
+            <w:r>
+              <w:rPr>
+                <w:sz w:val="18"/>
+                <w:szCs w:val="18"/>
+              </w:rPr>
+              <w:t xml:space="preserve">F-09 Two jobs could stage the same file</w:t>
+            </w:r>
+          </w:p>
+        </w:tc>
+        <w:tc>
+          <w:tcPr>
+            <w:tcW w:type="dxa" w:w="6360"/>
+            <w:tcBorders>
+              <w:top w:val="single" w:color="BFBFBF" w:sz="4"/>
+              <w:left w:val="single" w:color="BFBFBF" w:sz="4"/>
+              <w:bottom w:val="single" w:color="BFBFBF" w:sz="4"/>
+              <w:right w:val="single" w:color="BFBFBF" w:sz="4"/>
+            </w:tcBorders>
+            <w:tcMar>
+              <w:top w:type="dxa" w:w="60"/>
+              <w:left w:type="dxa" w:w="100"/>
+              <w:bottom w:type="dxa" w:w="60"/>
+              <w:right w:type="dxa" w:w="100"/>
+            </w:tcMar>
+          </w:tcPr>
+          <w:p>
+            <w:r>
+              <w:rPr>
+                <w:sz w:val="18"/>
+                <w:szCs w:val="18"/>
+              </w:rPr>
+              <w:t xml:space="preserve">The batch is locked (FOR UPDATE) and moved to Processing before anything else.</w:t>
+            </w:r>
+          </w:p>
+        </w:tc>
+      </w:tr>
+      <w:tr>
+        <w:tc>
+          <w:tcPr>
+            <w:tcW w:type="dxa" w:w="3000"/>
+            <w:tcBorders>
+              <w:top w:val="single" w:color="BFBFBF" w:sz="4"/>
+              <w:left w:val="single" w:color="BFBFBF" w:sz="4"/>
+              <w:bottom w:val="single" w:color="BFBFBF" w:sz="4"/>
+              <w:right w:val="single" w:color="BFBFBF" w:sz="4"/>
+            </w:tcBorders>
+            <w:tcMar>
+              <w:top w:type="dxa" w:w="60"/>
+              <w:left w:type="dxa" w:w="100"/>
+              <w:bottom w:type="dxa" w:w="60"/>
+              <w:right w:type="dxa" w:w="100"/>
+            </w:tcMar>
+          </w:tcPr>
+          <w:p>
+            <w:r>
+              <w:rPr>
+                <w:sz w:val="18"/>
+                <w:szCs w:val="18"/>
+              </w:rPr>
+              <w:t xml:space="preserve">F-10 An amount too large for the field failed the whole file</w:t>
+            </w:r>
+          </w:p>
+        </w:tc>
+        <w:tc>
+          <w:tcPr>
+            <w:tcW w:type="dxa" w:w="6360"/>
+            <w:tcBorders>
+              <w:top w:val="single" w:color="BFBFBF" w:sz="4"/>
+              <w:left w:val="single" w:color="BFBFBF" w:sz="4"/>
+              <w:bottom w:val="single" w:color="BFBFBF" w:sz="4"/>
+              <w:right w:val="single" w:color="BFBFBF" w:sz="4"/>
+            </w:tcBorders>
+            <w:tcMar>
+              <w:top w:type="dxa" w:w="60"/>
+              <w:left w:type="dxa" w:w="100"/>
+              <w:bottom w:type="dxa" w:w="60"/>
+              <w:right w:type="dxa" w:w="100"/>
+            </w:tcMar>
+          </w:tcPr>
+          <w:p>
+            <w:r>
+              <w:rPr>
+                <w:sz w:val="18"/>
+                <w:szCs w:val="18"/>
+              </w:rPr>
+              <w:t xml:space="preserve">Amounts of 10^16 or more are a row error ('too large'); mirrored in the Python port with three new vectors (Number(18,2) holds 16 digits before the point).</w:t>
+            </w:r>
+          </w:p>
+        </w:tc>
+      </w:tr>
+      <w:tr>
+        <w:tc>
+          <w:tcPr>
+            <w:tcW w:type="dxa" w:w="3000"/>
+            <w:tcBorders>
+              <w:top w:val="single" w:color="BFBFBF" w:sz="4"/>
+              <w:left w:val="single" w:color="BFBFBF" w:sz="4"/>
+              <w:bottom w:val="single" w:color="BFBFBF" w:sz="4"/>
+              <w:right w:val="single" w:color="BFBFBF" w:sz="4"/>
+            </w:tcBorders>
+            <w:tcMar>
+              <w:top w:type="dxa" w:w="60"/>
+              <w:left w:type="dxa" w:w="100"/>
+              <w:bottom w:type="dxa" w:w="60"/>
+              <w:right w:type="dxa" w:w="100"/>
+            </w:tcMar>
+          </w:tcPr>
+          <w:p>
+            <w:r>
+              <w:rPr>
+                <w:sz w:val="18"/>
+                <w:szCs w:val="18"/>
+              </w:rPr>
+              <w:t xml:space="preserve">F-12 A long flag list could cut the last flag in half</w:t>
+            </w:r>
+          </w:p>
+        </w:tc>
+        <w:tc>
+          <w:tcPr>
+            <w:tcW w:type="dxa" w:w="6360"/>
+            <w:tcBorders>
+              <w:top w:val="single" w:color="BFBFBF" w:sz="4"/>
+              <w:left w:val="single" w:color="BFBFBF" w:sz="4"/>
+              <w:bottom w:val="single" w:color="BFBFBF" w:sz="4"/>
+              <w:right w:val="single" w:color="BFBFBF" w:sz="4"/>
+            </w:tcBorders>
+            <w:tcMar>
+              <w:top w:type="dxa" w:w="60"/>
+              <w:left w:type="dxa" w:w="100"/>
+              <w:bottom w:type="dxa" w:w="60"/>
+              <w:right w:type="dxa" w:w="100"/>
+            </w:tcMar>
+          </w:tcPr>
+          <w:p>
+            <w:r>
+              <w:rPr>
+                <w:sz w:val="18"/>
+                <w:szCs w:val="18"/>
+              </w:rPr>
+              <w:t xml:space="preserve">Whole flags are kept and any that do not fit are dropped; FOLLOW_UP_CLOSED is always kept last.</w:t>
+            </w:r>
+          </w:p>
+        </w:tc>
+      </w:tr>
+    </w:tbl>
+    <w:p>
+      <w:pPr>
+        <w:spacing w:after="120"/>
+      </w:pPr>
+    </w:p>
+    <w:p>
+      <w:pPr>
+        <w:pStyle w:val="Heading2"/>
+      </w:pPr>
+      <w:r>
+        <w:t xml:space="preserve">19.2 Repository fixes</w:t>
+      </w:r>
+    </w:p>
+    <w:p>
+      <w:pPr>
+        <w:pStyle w:val="ListParagraph"/>
+        <w:numPr>
+          <w:ilvl w:val="0"/>
+          <w:numId w:val="3"/>
+        </w:numPr>
+        <w:spacing w:after="60"/>
+      </w:pPr>
+      <w:r>
+        <w:t xml:space="preserve">README counts corrected (42 Jest tests, not 50; 159 Apex tests) and the push-job setup steps written into the README instead of linking a guide that was not in the repository. The run guides for phases 1 to 3B are now included.</w:t>
+      </w:r>
+    </w:p>
+    <w:p>
+      <w:pPr>
+        <w:pStyle w:val="ListParagraph"/>
+        <w:numPr>
+          <w:ilvl w:val="0"/>
+          <w:numId w:val="3"/>
+        </w:numPr>
+        <w:spacing w:after="60"/>
+      </w:pPr>
+      <w:r>
+        <w:t xml:space="preserve">PROJECT_CONTEXT.md (working notes with the org username and our working agreements) is git-ignored and kept in the Claude Project; a public ARCHITECTURE.md carries the technical content. The org username was removed from the JWT setup guide.</w:t>
+      </w:r>
+    </w:p>
+    <w:p>
+      <w:pPr>
+        <w:pStyle w:val="ListParagraph"/>
+        <w:numPr>
+          <w:ilvl w:val="0"/>
+          <w:numId w:val="3"/>
+        </w:numPr>
+        <w:spacing w:after="60"/>
+      </w:pPr>
+      <w:r>
+        <w:t xml:space="preserve">Prettier: an Apex override (tab width 4, print width 160) and every Apex file reformatted to it, so the pre-commit hook no longer rewrites the codebase (verified: only whitespace changed). Sample CSVs keep their line endings (*.csv -text). Unused CSS removed, a misplaced comment moved, package name set, template leftovers removed from the repository.</w:t>
+      </w:r>
+    </w:p>
+    <w:p>
+      <w:pPr>
+        <w:pStyle w:val="Heading2"/>
+      </w:pPr>
+      <w:r>
+        <w:t xml:space="preserve">19.3 Verification</w:t>
+      </w:r>
+    </w:p>
+    <w:p>
+      <w:pPr>
+        <w:pStyle w:val="ListParagraph"/>
+        <w:numPr>
+          <w:ilvl w:val="0"/>
+          <w:numId w:val="3"/>
+        </w:numPr>
+        <w:spacing w:after="60"/>
+      </w:pPr>
+      <w:r>
+        <w:t xml:space="preserve">159 Apex tests in 22 classes (new: team member choice, one code review per firm, assignment never takes others' rows, confirmed trade date, whole flags, processing lock, another dealer's profile, oversized amount). Parse, PMD (zero findings), lint, cross-reference, Python vectors (18 amounts), 42 Jest tests.</w:t>
+      </w:r>
+    </w:p>
+    <w:p>
+      <w:pPr>
+        <w:pStyle w:val="Heading3"/>
+      </w:pPr>
+      <w:r>
+        <w:t xml:space="preserve">Field definition</w:t>
+      </w:r>
+    </w:p>
+    <w:p>
+      <w:pPr>
+        <w:spacing w:after="0"/>
+        <w:ind w:left="200"/>
+      </w:pPr>
+      <w:r>
+        <w:rPr>
+          <w:b/>
+          <w:bCs/>
+          <w:sz w:val="20"/>
+          <w:szCs w:val="20"/>
+        </w:rPr>
+        <w:t xml:space="preserve">Name: </w:t>
+      </w:r>
+      <w:r>
+        <w:rPr>
+          <w:sz w:val="20"/>
+          <w:szCs w:val="20"/>
+        </w:rPr>
+        <w:t xml:space="preserve">Advisor Override</w:t>
+      </w:r>
+    </w:p>
+    <w:p>
+      <w:pPr>
+        <w:spacing w:after="0"/>
+        <w:ind w:left="200"/>
+      </w:pPr>
+      <w:r>
+        <w:rPr>
+          <w:b/>
+          <w:bCs/>
+          <w:sz w:val="20"/>
+          <w:szCs w:val="20"/>
+        </w:rPr>
+        <w:t xml:space="preserve">API: </w:t>
+      </w:r>
+      <w:r>
+        <w:rPr>
+          <w:sz w:val="20"/>
+          <w:szCs w:val="20"/>
+        </w:rPr>
+        <w:t xml:space="preserve">Advisor_Override__c</w:t>
+      </w:r>
+    </w:p>
+    <w:p>
+      <w:pPr>
+        <w:spacing w:after="0"/>
+        <w:ind w:left="200"/>
+      </w:pPr>
+      <w:r>
+        <w:rPr>
+          <w:b/>
+          <w:bCs/>
+          <w:sz w:val="20"/>
+          <w:szCs w:val="20"/>
+        </w:rPr>
+        <w:t xml:space="preserve">Type: </w:t>
+      </w:r>
+      <w:r>
+        <w:rPr>
+          <w:sz w:val="20"/>
+          <w:szCs w:val="20"/>
+        </w:rPr>
+        <w:t xml:space="preserve">Lookup(Contact), optional, clear value if deleted</w:t>
+      </w:r>
+    </w:p>
+    <w:p>
+      <w:pPr>
+        <w:spacing w:after="0"/>
+        <w:ind w:left="200"/>
+      </w:pPr>
+      <w:r>
+        <w:rPr>
+          <w:b/>
+          <w:bCs/>
+          <w:sz w:val="20"/>
+          <w:szCs w:val="20"/>
+        </w:rPr>
+        <w:t xml:space="preserve">Description: </w:t>
+      </w:r>
+      <w:r>
+        <w:rPr>
+          <w:sz w:val="20"/>
+          <w:szCs w:val="20"/>
+        </w:rPr>
+        <w:t xml:space="preserve">The team member a reviewer chose to credit when the row's advisor name fits more than one member of a team code (flag ADVISOR_AMBIGUOUS), for example "Chen" on a team with Ryan and Megan Chen. Matching credits this advisor 100% if they hold the code on the trade date, and flags the row ADVISOR_FROM_REVIEWER. If left blank on accept, Claude's suggested advisor is used.</w:t>
+      </w:r>
+    </w:p>
+    <w:p>
+      <w:pPr>
+        <w:pBdr>
+          <w:bottom w:val="single" w:color="D9D9D9" w:sz="2" w:space="4"/>
+        </w:pBdr>
+        <w:spacing w:after="160"/>
+        <w:ind w:left="200"/>
+      </w:pPr>
+      <w:r>
+        <w:rPr>
+          <w:b/>
+          <w:bCs/>
+          <w:sz w:val="20"/>
+          <w:szCs w:val="20"/>
+        </w:rPr>
+        <w:t xml:space="preserve">Help: </w:t>
+      </w:r>
+      <w:r>
+        <w:rPr>
+          <w:sz w:val="20"/>
+          <w:szCs w:val="20"/>
+        </w:rPr>
+        <w:t xml:space="preserve">Choose which team member to credit when the advisor name on the row fits more than one of them.</w:t>
       </w:r>
     </w:p>
     <w:sectPr>

</xml_diff>

<commit_message>
Review feedback: settle code reviews in the app, label AUM rows, show open choices
</commit_message>
<xml_diff>
--- a/docs/Trade_Import_Build_Log.docx
+++ b/docs/Trade_Import_Build_Log.docx
@@ -48241,6 +48241,391 @@
           <w:szCs w:val="20"/>
         </w:rPr>
         <w:t xml:space="preserve">Choose which team member to credit when the advisor name on the row fits more than one of them.</w:t>
+      </w:r>
+    </w:p>
+    <w:p>
+      <w:pPr>
+        <w:pStyle w:val="Heading1"/>
+      </w:pPr>
+      <w:r>
+        <w:t xml:space="preserve">20. Review feedback: settling code reviews in the app (2026-10-28)</w:t>
+      </w:r>
+    </w:p>
+    <w:p>
+      <w:pPr>
+        <w:spacing w:after="120"/>
+      </w:pPr>
+      <w:r>
+        <w:t xml:space="preserve">Feedback from using the app on the Northgate code 8800 review and a fund question, with marked-up screenshots: the code review's summary line was confusing, a blank Suggestion cell read as broken when Claude was unsure, the lines under Claude's table had no headings, and resolving a code review meant leaving the app for the record page.</w:t>
+      </w:r>
+    </w:p>
+    <w:tbl>
+      <w:tblPr>
+        <w:tblW w:type="dxa" w:w="9360"/>
+        <w:tblBorders>
+          <w:top w:val="single" w:color="auto" w:sz="4"/>
+          <w:left w:val="single" w:color="auto" w:sz="4"/>
+          <w:bottom w:val="single" w:color="auto" w:sz="4"/>
+          <w:right w:val="single" w:color="auto" w:sz="4"/>
+          <w:insideH w:val="single" w:color="auto" w:sz="4"/>
+          <w:insideV w:val="single" w:color="auto" w:sz="4"/>
+        </w:tblBorders>
+      </w:tblPr>
+      <w:tblGrid>
+        <w:gridCol w:w="3000"/>
+        <w:gridCol w:w="6360"/>
+      </w:tblGrid>
+      <w:tr>
+        <w:trPr>
+          <w:tblHeader/>
+        </w:trPr>
+        <w:tc>
+          <w:tcPr>
+            <w:tcW w:type="dxa" w:w="3000"/>
+            <w:tcBorders>
+              <w:top w:val="single" w:color="BFBFBF" w:sz="4"/>
+              <w:left w:val="single" w:color="BFBFBF" w:sz="4"/>
+              <w:bottom w:val="single" w:color="BFBFBF" w:sz="4"/>
+              <w:right w:val="single" w:color="BFBFBF" w:sz="4"/>
+            </w:tcBorders>
+            <w:shd w:fill="DCE6F1" w:color="auto" w:val="clear"/>
+            <w:tcMar>
+              <w:top w:type="dxa" w:w="60"/>
+              <w:left w:type="dxa" w:w="100"/>
+              <w:bottom w:type="dxa" w:w="60"/>
+              <w:right w:type="dxa" w:w="100"/>
+            </w:tcMar>
+          </w:tcPr>
+          <w:p>
+            <w:r>
+              <w:rPr>
+                <w:b/>
+                <w:bCs/>
+                <w:sz w:val="18"/>
+                <w:szCs w:val="18"/>
+              </w:rPr>
+              <w:t xml:space="preserve">Feedback</w:t>
+            </w:r>
+          </w:p>
+        </w:tc>
+        <w:tc>
+          <w:tcPr>
+            <w:tcW w:type="dxa" w:w="6360"/>
+            <w:tcBorders>
+              <w:top w:val="single" w:color="BFBFBF" w:sz="4"/>
+              <w:left w:val="single" w:color="BFBFBF" w:sz="4"/>
+              <w:bottom w:val="single" w:color="BFBFBF" w:sz="4"/>
+              <w:right w:val="single" w:color="BFBFBF" w:sz="4"/>
+            </w:tcBorders>
+            <w:shd w:fill="DCE6F1" w:color="auto" w:val="clear"/>
+            <w:tcMar>
+              <w:top w:type="dxa" w:w="60"/>
+              <w:left w:type="dxa" w:w="100"/>
+              <w:bottom w:type="dxa" w:w="60"/>
+              <w:right w:type="dxa" w:w="100"/>
+            </w:tcMar>
+          </w:tcPr>
+          <w:p>
+            <w:r>
+              <w:rPr>
+                <w:b/>
+                <w:bCs/>
+                <w:sz w:val="18"/>
+                <w:szCs w:val="18"/>
+              </w:rPr>
+              <w:t xml:space="preserve">Change</w:t>
+            </w:r>
+          </w:p>
+        </w:tc>
+      </w:tr>
+      <w:tr>
+        <w:tc>
+          <w:tcPr>
+            <w:tcW w:type="dxa" w:w="3000"/>
+            <w:tcBorders>
+              <w:top w:val="single" w:color="BFBFBF" w:sz="4"/>
+              <w:left w:val="single" w:color="BFBFBF" w:sz="4"/>
+              <w:bottom w:val="single" w:color="BFBFBF" w:sz="4"/>
+              <w:right w:val="single" w:color="BFBFBF" w:sz="4"/>
+            </w:tcBorders>
+            <w:tcMar>
+              <w:top w:type="dxa" w:w="60"/>
+              <w:left w:type="dxa" w:w="100"/>
+              <w:bottom w:type="dxa" w:w="60"/>
+              <w:right w:type="dxa" w:w="100"/>
+            </w:tcMar>
+          </w:tcPr>
+          <w:p>
+            <w:r>
+              <w:rPr>
+                <w:sz w:val="18"/>
+                <w:szCs w:val="18"/>
+              </w:rPr>
+              <w:t xml:space="preserve">Summary line hard to read, and '2 held ($1,200,000.00)' did not match the $11,000,000 listed</w:t>
+            </w:r>
+          </w:p>
+        </w:tc>
+        <w:tc>
+          <w:tcPr>
+            <w:tcW w:type="dxa" w:w="6360"/>
+            <w:tcBorders>
+              <w:top w:val="single" w:color="BFBFBF" w:sz="4"/>
+              <w:left w:val="single" w:color="BFBFBF" w:sz="4"/>
+              <w:bottom w:val="single" w:color="BFBFBF" w:sz="4"/>
+              <w:right w:val="single" w:color="BFBFBF" w:sz="4"/>
+            </w:tcBorders>
+            <w:tcMar>
+              <w:top w:type="dxa" w:w="60"/>
+              <w:left w:type="dxa" w:w="100"/>
+              <w:bottom w:type="dxa" w:w="60"/>
+              <w:right w:type="dxa" w:w="100"/>
+            </w:tcMar>
+          </w:tcPr>
+          <w:p>
+            <w:r>
+              <w:rPr>
+                <w:sz w:val="18"/>
+                <w:szCs w:val="18"/>
+              </w:rPr>
+              <w:t xml:space="preserve">Not a wrong total: one held row was an AUM position balance ($9,800,000), and the held amount counts trades only. The line now reads, for example, 'The code's shares add up to less than 100% · 1 trade ($1,200,000.00) and 1 AUM balance held'. The table is titled Held rows, has a Type column (Trade or AUM balance), drops the repeated issue column, and shows 'None named' or 'None given' for blanks. The queue line reads '2 rows · $1,200,000.00' and the note above the list '8 rows ($1,620,000.00 in trades) are held…'.</w:t>
+            </w:r>
+          </w:p>
+        </w:tc>
+      </w:tr>
+      <w:tr>
+        <w:tc>
+          <w:tcPr>
+            <w:tcW w:type="dxa" w:w="3000"/>
+            <w:tcBorders>
+              <w:top w:val="single" w:color="BFBFBF" w:sz="4"/>
+              <w:left w:val="single" w:color="BFBFBF" w:sz="4"/>
+              <w:bottom w:val="single" w:color="BFBFBF" w:sz="4"/>
+              <w:right w:val="single" w:color="BFBFBF" w:sz="4"/>
+            </w:tcBorders>
+            <w:tcMar>
+              <w:top w:type="dxa" w:w="60"/>
+              <w:left w:type="dxa" w:w="100"/>
+              <w:bottom w:type="dxa" w:w="60"/>
+              <w:right w:type="dxa" w:w="100"/>
+            </w:tcMar>
+          </w:tcPr>
+          <w:p>
+            <w:r>
+              <w:rPr>
+                <w:sz w:val="18"/>
+                <w:szCs w:val="18"/>
+              </w:rPr>
+              <w:t xml:space="preserve">Empty suggestion when Claude's confidence is low</w:t>
+            </w:r>
+          </w:p>
+        </w:tc>
+        <w:tc>
+          <w:tcPr>
+            <w:tcW w:type="dxa" w:w="6360"/>
+            <w:tcBorders>
+              <w:top w:val="single" w:color="BFBFBF" w:sz="4"/>
+              <w:left w:val="single" w:color="BFBFBF" w:sz="4"/>
+              <w:bottom w:val="single" w:color="BFBFBF" w:sz="4"/>
+              <w:right w:val="single" w:color="BFBFBF" w:sz="4"/>
+            </w:tcBorders>
+            <w:tcMar>
+              <w:top w:type="dxa" w:w="60"/>
+              <w:left w:type="dxa" w:w="100"/>
+              <w:bottom w:type="dxa" w:w="60"/>
+              <w:right w:type="dxa" w:w="100"/>
+            </w:tcMar>
+          </w:tcPr>
+          <w:p>
+            <w:r>
+              <w:rPr>
+                <w:sz w:val="18"/>
+                <w:szCs w:val="18"/>
+              </w:rPr>
+              <w:t xml:space="preserve">Claude still leaves a field empty when nothing points to one answer (it must not guess). The app now shows the choices it weighed instead: 'Series A or Series F' from the row's match candidates, or, on a code review, the advisors who hold the code; with nothing to list, 'Ask the firm'. Shown in italics and marked openQuestion. The record-page table shows 'No single answer'.</w:t>
+            </w:r>
+          </w:p>
+        </w:tc>
+      </w:tr>
+      <w:tr>
+        <w:tc>
+          <w:tcPr>
+            <w:tcW w:type="dxa" w:w="3000"/>
+            <w:tcBorders>
+              <w:top w:val="single" w:color="BFBFBF" w:sz="4"/>
+              <w:left w:val="single" w:color="BFBFBF" w:sz="4"/>
+              <w:bottom w:val="single" w:color="BFBFBF" w:sz="4"/>
+              <w:right w:val="single" w:color="BFBFBF" w:sz="4"/>
+            </w:tcBorders>
+            <w:tcMar>
+              <w:top w:type="dxa" w:w="60"/>
+              <w:left w:type="dxa" w:w="100"/>
+              <w:bottom w:type="dxa" w:w="60"/>
+              <w:right w:type="dxa" w:w="100"/>
+            </w:tcMar>
+          </w:tcPr>
+          <w:p>
+            <w:r>
+              <w:rPr>
+                <w:sz w:val="18"/>
+                <w:szCs w:val="18"/>
+              </w:rPr>
+              <w:t xml:space="preserve">Lines under Claude's table need a heading</w:t>
+            </w:r>
+          </w:p>
+        </w:tc>
+        <w:tc>
+          <w:tcPr>
+            <w:tcW w:type="dxa" w:w="6360"/>
+            <w:tcBorders>
+              <w:top w:val="single" w:color="BFBFBF" w:sz="4"/>
+              <w:left w:val="single" w:color="BFBFBF" w:sz="4"/>
+              <w:bottom w:val="single" w:color="BFBFBF" w:sz="4"/>
+              <w:right w:val="single" w:color="BFBFBF" w:sz="4"/>
+            </w:tcBorders>
+            <w:tcMar>
+              <w:top w:type="dxa" w:w="60"/>
+              <w:left w:type="dxa" w:w="100"/>
+              <w:bottom w:type="dxa" w:w="60"/>
+              <w:right w:type="dxa" w:w="100"/>
+            </w:tcMar>
+          </w:tcPr>
+          <w:p>
+            <w:r>
+              <w:rPr>
+                <w:sz w:val="18"/>
+                <w:szCs w:val="18"/>
+              </w:rPr>
+              <w:t xml:space="preserve">Labelled Why (Claude's root cause) and Question for the firm (replacing 'Ask the dealer:'), in the app and on the record pages.</w:t>
+            </w:r>
+          </w:p>
+        </w:tc>
+      </w:tr>
+      <w:tr>
+        <w:tc>
+          <w:tcPr>
+            <w:tcW w:type="dxa" w:w="3000"/>
+            <w:tcBorders>
+              <w:top w:val="single" w:color="BFBFBF" w:sz="4"/>
+              <w:left w:val="single" w:color="BFBFBF" w:sz="4"/>
+              <w:bottom w:val="single" w:color="BFBFBF" w:sz="4"/>
+              <w:right w:val="single" w:color="BFBFBF" w:sz="4"/>
+            </w:tcBorders>
+            <w:tcMar>
+              <w:top w:type="dxa" w:w="60"/>
+              <w:left w:type="dxa" w:w="100"/>
+              <w:bottom w:type="dxa" w:w="60"/>
+              <w:right w:type="dxa" w:w="100"/>
+            </w:tcMar>
+          </w:tcPr>
+          <w:p>
+            <w:r>
+              <w:rPr>
+                <w:sz w:val="18"/>
+                <w:szCs w:val="18"/>
+              </w:rPr>
+              <w:t xml:space="preserve">Resolve the code review here</w:t>
+            </w:r>
+          </w:p>
+        </w:tc>
+        <w:tc>
+          <w:tcPr>
+            <w:tcW w:type="dxa" w:w="6360"/>
+            <w:tcBorders>
+              <w:top w:val="single" w:color="BFBFBF" w:sz="4"/>
+              <w:left w:val="single" w:color="BFBFBF" w:sz="4"/>
+              <w:bottom w:val="single" w:color="BFBFBF" w:sz="4"/>
+              <w:right w:val="single" w:color="BFBFBF" w:sz="4"/>
+            </w:tcBorders>
+            <w:tcMar>
+              <w:top w:type="dxa" w:w="60"/>
+              <w:left w:type="dxa" w:w="100"/>
+              <w:bottom w:type="dxa" w:w="60"/>
+              <w:right w:type="dxa" w:w="100"/>
+            </w:tcMar>
+          </w:tcPr>
+          <w:p>
+            <w:r>
+              <w:rPr>
+                <w:sz w:val="18"/>
+                <w:szCs w:val="18"/>
+              </w:rPr>
+              <w:t xml:space="preserve">A Your decision section on every code review: Advisor to credit (the people holding the code on every held row's date, Claude's pick pre-chosen when it is one of them) with Credit all N rows; Code fixed: re-match; and Decide rows one by one. Open the follow-up record stays as a link.</w:t>
+            </w:r>
+          </w:p>
+        </w:tc>
+      </w:tr>
+    </w:tbl>
+    <w:p>
+      <w:pPr>
+        <w:spacing w:after="120"/>
+      </w:pPr>
+    </w:p>
+    <w:p>
+      <w:pPr>
+        <w:pStyle w:val="Heading2"/>
+      </w:pPr>
+      <w:r>
+        <w:t xml:space="preserve">20.1 How the new actions work</w:t>
+      </w:r>
+    </w:p>
+    <w:p>
+      <w:pPr>
+        <w:pStyle w:val="ListParagraph"/>
+        <w:numPr>
+          <w:ilvl w:val="0"/>
+          <w:numId w:val="3"/>
+        </w:numPr>
+        <w:spacing w:after="60"/>
+      </w:pPr>
+      <w:r>
+        <w:t xml:space="preserve">creditCodeReview(followUpId, advisorId): only for Allocation Incomplete, Reassignment Suspected and Code Dormant reviews with a rep code. Locks the review, checks the advisor held the code on every held row's date (refuses otherwise), sets Advisor Override and the decision stamp (Decided By, Decided At) on each held row (at most 200), then sets the review to Resolved. The existing trigger releases the rows and re-matches them, and matching credits that advisor 100% (ADVISOR_FROM_REVIEWER).</w:t>
+      </w:r>
+    </w:p>
+    <w:p>
+      <w:pPr>
+        <w:pStyle w:val="ListParagraph"/>
+        <w:numPr>
+          <w:ilvl w:val="0"/>
+          <w:numId w:val="3"/>
+        </w:numPr>
+        <w:spacing w:after="60"/>
+      </w:pPr>
+      <w:r>
+        <w:t xml:space="preserve">closeCodeReview(followUpId, fixed): Resolved (re-match after the code was fixed in Salesforce) or Closed - No Action (rows go to Needs Decision with FOLLOW_UP_CLOSED). Both refuse a review that is already closed, and add a dated line to Resolution Notes naming who did it.</w:t>
+      </w:r>
+    </w:p>
+    <w:p>
+      <w:pPr>
+        <w:pStyle w:val="ListParagraph"/>
+        <w:numPr>
+          <w:ilvl w:val="0"/>
+          <w:numId w:val="3"/>
+        </w:numPr>
+        <w:spacing w:after="60"/>
+      </w:pPr>
+      <w:r>
+        <w:t xml:space="preserve">No new fields or permissions: the Reviewer permission set already edits these fields; the credit test runs as a reviewer-only user.</w:t>
+      </w:r>
+    </w:p>
+    <w:p>
+      <w:pPr>
+        <w:pStyle w:val="Heading2"/>
+      </w:pPr>
+      <w:r>
+        <w:t xml:space="preserve">20.2 Verification</w:t>
+      </w:r>
+    </w:p>
+    <w:p>
+      <w:pPr>
+        <w:pStyle w:val="ListParagraph"/>
+        <w:numPr>
+          <w:ilvl w:val="0"/>
+          <w:numId w:val="3"/>
+        </w:numPr>
+        <w:spacing w:after="60"/>
+      </w:pPr>
+      <w:r>
+        <w:t xml:space="preserve">163 Apex tests (new: crediting one advisor as a reviewer, re-match and send to Needs Decision, choice text and candidate names, a fund Claude left open). The local Apex parser caught SOQL aliases named first and last (reserved words) before the org did. PMD zero findings, lint and cross-reference clean. 50 Jest tests (new: AUM labels, credit, re-match and send, headings, open choices, helpers); negative control: sending no advisor or the wrong re-match flag fails 2.</w:t>
       </w:r>
     </w:p>
     <w:sectPr>

</xml_diff>